<commit_message>
Add HCI Lab 05 assets and Assignment 2 files
Add Lab 05 deliverables and update Assignment 2 resources. This commit adds a Lab05 Word document, a Mood Board PNG, and four UETM prototype PNGs under HCI Labs/Lab 05, replaces/updates the HCI Assignment2 .docx, and adds a PDF export of the assignment under HCI Theroy/Assigment2.
</commit_message>
<xml_diff>
--- a/HCI Theroy/Assigment2/23MDSWE248 HCI Assignment2.docx
+++ b/HCI Theroy/Assigment2/23MDSWE248 HCI Assignment2.docx
@@ -3862,7 +3862,7 @@
                     </pic:cNvPicPr>
                   </pic:nvPicPr>
                   <pic:blipFill>
-                    <a:blip r:embed="rId5">
+                    <a:blip r:embed="rId6">
                       <a:extLst>
                         <a:ext uri="{28A0092B-C50C-407E-A947-70E740481C1C}">
                           <a14:useLocalDpi xmlns:a14="http://schemas.microsoft.com/office/drawing/2010/main" val="0"/>
@@ -4806,7 +4806,7 @@
         </w:rPr>
         <w:t xml:space="preserve">Tool: </w:t>
       </w:r>
-      <w:hyperlink r:id="rId6" w:history="1">
+      <w:hyperlink r:id="rId7" w:history="1">
         <w:r>
           <w:rPr>
             <w:rStyle w:val="Hyperlink"/>
@@ -4883,7 +4883,7 @@
                     <pic:cNvPicPr/>
                   </pic:nvPicPr>
                   <pic:blipFill>
-                    <a:blip r:embed="rId7"/>
+                    <a:blip r:embed="rId8"/>
                     <a:stretch>
                       <a:fillRect/>
                     </a:stretch>
@@ -4967,7 +4967,7 @@
                     <pic:cNvPicPr/>
                   </pic:nvPicPr>
                   <pic:blipFill rotWithShape="1">
-                    <a:blip r:embed="rId8"/>
+                    <a:blip r:embed="rId9"/>
                     <a:srcRect t="943"/>
                     <a:stretch/>
                   </pic:blipFill>
@@ -5059,7 +5059,7 @@
                     <pic:cNvPicPr/>
                   </pic:nvPicPr>
                   <pic:blipFill>
-                    <a:blip r:embed="rId9"/>
+                    <a:blip r:embed="rId10"/>
                     <a:stretch>
                       <a:fillRect/>
                     </a:stretch>
@@ -5129,88 +5129,6 @@
             <wp:extent cx="5899150" cy="3289911"/>
             <wp:effectExtent l="0" t="0" r="6350" b="6350"/>
             <wp:docPr id="14" name="Picture 14"/>
-            <wp:cNvGraphicFramePr>
-              <a:graphicFrameLocks xmlns:a="http://schemas.openxmlformats.org/drawingml/2006/main" noChangeAspect="1"/>
-            </wp:cNvGraphicFramePr>
-            <a:graphic xmlns:a="http://schemas.openxmlformats.org/drawingml/2006/main">
-              <a:graphicData uri="http://schemas.openxmlformats.org/drawingml/2006/picture">
-                <pic:pic xmlns:pic="http://schemas.openxmlformats.org/drawingml/2006/picture">
-                  <pic:nvPicPr>
-                    <pic:cNvPr id="1" name=""/>
-                    <pic:cNvPicPr/>
-                  </pic:nvPicPr>
-                  <pic:blipFill>
-                    <a:blip r:embed="rId10"/>
-                    <a:stretch>
-                      <a:fillRect/>
-                    </a:stretch>
-                  </pic:blipFill>
-                  <pic:spPr>
-                    <a:xfrm>
-                      <a:off x="0" y="0"/>
-                      <a:ext cx="5901776" cy="3291375"/>
-                    </a:xfrm>
-                    <a:prstGeom prst="rect">
-                      <a:avLst/>
-                    </a:prstGeom>
-                  </pic:spPr>
-                </pic:pic>
-              </a:graphicData>
-            </a:graphic>
-          </wp:inline>
-        </w:drawing>
-      </w:r>
-    </w:p>
-    <w:p>
-      <w:pPr>
-        <w:pStyle w:val="Caption"/>
-        <w:jc w:val="center"/>
-        <w:rPr>
-          <w:rFonts w:ascii="Times New Roman" w:hAnsi="Times New Roman" w:cs="Times New Roman"/>
-          <w:sz w:val="28"/>
-          <w:szCs w:val="16"/>
-        </w:rPr>
-      </w:pPr>
-      <w:r>
-        <w:t xml:space="preserve">Figure </w:t>
-      </w:r>
-      <w:r>
-        <w:fldChar w:fldCharType="begin"/>
-      </w:r>
-      <w:r>
-        <w:instrText xml:space="preserve"> SEQ Figure \* ARABIC </w:instrText>
-      </w:r>
-      <w:r>
-        <w:fldChar w:fldCharType="separate"/>
-      </w:r>
-      <w:r>
-        <w:rPr>
-          <w:noProof/>
-        </w:rPr>
-        <w:t>4</w:t>
-      </w:r>
-      <w:r>
-        <w:fldChar w:fldCharType="end"/>
-      </w:r>
-    </w:p>
-    <w:p>
-      <w:pPr>
-        <w:keepNext/>
-        <w:jc w:val="center"/>
-      </w:pPr>
-      <w:r>
-        <w:rPr>
-          <w:rFonts w:ascii="Times New Roman" w:hAnsi="Times New Roman" w:cs="Times New Roman"/>
-          <w:noProof/>
-          <w:sz w:val="28"/>
-          <w:szCs w:val="16"/>
-        </w:rPr>
-        <w:lastRenderedPageBreak/>
-        <w:drawing>
-          <wp:inline distT="0" distB="0" distL="0" distR="0" wp14:anchorId="057DA3AD" wp14:editId="0C6811E7">
-            <wp:extent cx="5943600" cy="3334385"/>
-            <wp:effectExtent l="0" t="0" r="0" b="0"/>
-            <wp:docPr id="15" name="Picture 15"/>
             <wp:cNvGraphicFramePr>
               <a:graphicFrameLocks xmlns:a="http://schemas.openxmlformats.org/drawingml/2006/main" noChangeAspect="1"/>
             </wp:cNvGraphicFramePr>
@@ -5230,7 +5148,7 @@
                   <pic:spPr>
                     <a:xfrm>
                       <a:off x="0" y="0"/>
-                      <a:ext cx="5943600" cy="3334385"/>
+                      <a:ext cx="5901776" cy="3291375"/>
                     </a:xfrm>
                     <a:prstGeom prst="rect">
                       <a:avLst/>
@@ -5269,7 +5187,7 @@
         <w:rPr>
           <w:noProof/>
         </w:rPr>
-        <w:t>5</w:t>
+        <w:t>4</w:t>
       </w:r>
       <w:r>
         <w:fldChar w:fldCharType="end"/>
@@ -5287,11 +5205,12 @@
           <w:sz w:val="28"/>
           <w:szCs w:val="16"/>
         </w:rPr>
+        <w:lastRenderedPageBreak/>
         <w:drawing>
-          <wp:inline distT="0" distB="0" distL="0" distR="0" wp14:anchorId="710F2EF8" wp14:editId="59408456">
-            <wp:extent cx="5943600" cy="3316605"/>
+          <wp:inline distT="0" distB="0" distL="0" distR="0" wp14:anchorId="057DA3AD" wp14:editId="0C6811E7">
+            <wp:extent cx="5943600" cy="3334385"/>
             <wp:effectExtent l="0" t="0" r="0" b="0"/>
-            <wp:docPr id="16" name="Picture 16"/>
+            <wp:docPr id="15" name="Picture 15"/>
             <wp:cNvGraphicFramePr>
               <a:graphicFrameLocks xmlns:a="http://schemas.openxmlformats.org/drawingml/2006/main" noChangeAspect="1"/>
             </wp:cNvGraphicFramePr>
@@ -5311,6 +5230,87 @@
                   <pic:spPr>
                     <a:xfrm>
                       <a:off x="0" y="0"/>
+                      <a:ext cx="5943600" cy="3334385"/>
+                    </a:xfrm>
+                    <a:prstGeom prst="rect">
+                      <a:avLst/>
+                    </a:prstGeom>
+                  </pic:spPr>
+                </pic:pic>
+              </a:graphicData>
+            </a:graphic>
+          </wp:inline>
+        </w:drawing>
+      </w:r>
+    </w:p>
+    <w:p>
+      <w:pPr>
+        <w:pStyle w:val="Caption"/>
+        <w:jc w:val="center"/>
+        <w:rPr>
+          <w:rFonts w:ascii="Times New Roman" w:hAnsi="Times New Roman" w:cs="Times New Roman"/>
+          <w:sz w:val="28"/>
+          <w:szCs w:val="16"/>
+        </w:rPr>
+      </w:pPr>
+      <w:r>
+        <w:t xml:space="preserve">Figure </w:t>
+      </w:r>
+      <w:r>
+        <w:fldChar w:fldCharType="begin"/>
+      </w:r>
+      <w:r>
+        <w:instrText xml:space="preserve"> SEQ Figure \* ARABIC </w:instrText>
+      </w:r>
+      <w:r>
+        <w:fldChar w:fldCharType="separate"/>
+      </w:r>
+      <w:r>
+        <w:rPr>
+          <w:noProof/>
+        </w:rPr>
+        <w:t>5</w:t>
+      </w:r>
+      <w:r>
+        <w:fldChar w:fldCharType="end"/>
+      </w:r>
+    </w:p>
+    <w:p>
+      <w:pPr>
+        <w:keepNext/>
+        <w:jc w:val="center"/>
+      </w:pPr>
+      <w:r>
+        <w:rPr>
+          <w:rFonts w:ascii="Times New Roman" w:hAnsi="Times New Roman" w:cs="Times New Roman"/>
+          <w:noProof/>
+          <w:sz w:val="28"/>
+          <w:szCs w:val="16"/>
+        </w:rPr>
+        <w:drawing>
+          <wp:inline distT="0" distB="0" distL="0" distR="0" wp14:anchorId="710F2EF8" wp14:editId="59408456">
+            <wp:extent cx="5943600" cy="3316605"/>
+            <wp:effectExtent l="0" t="0" r="0" b="0"/>
+            <wp:docPr id="16" name="Picture 16"/>
+            <wp:cNvGraphicFramePr>
+              <a:graphicFrameLocks xmlns:a="http://schemas.openxmlformats.org/drawingml/2006/main" noChangeAspect="1"/>
+            </wp:cNvGraphicFramePr>
+            <a:graphic xmlns:a="http://schemas.openxmlformats.org/drawingml/2006/main">
+              <a:graphicData uri="http://schemas.openxmlformats.org/drawingml/2006/picture">
+                <pic:pic xmlns:pic="http://schemas.openxmlformats.org/drawingml/2006/picture">
+                  <pic:nvPicPr>
+                    <pic:cNvPr id="1" name=""/>
+                    <pic:cNvPicPr/>
+                  </pic:nvPicPr>
+                  <pic:blipFill>
+                    <a:blip r:embed="rId13"/>
+                    <a:stretch>
+                      <a:fillRect/>
+                    </a:stretch>
+                  </pic:blipFill>
+                  <pic:spPr>
+                    <a:xfrm>
+                      <a:off x="0" y="0"/>
                       <a:ext cx="5943600" cy="3316605"/>
                     </a:xfrm>
                     <a:prstGeom prst="rect">
@@ -6282,8 +6282,6 @@
         <w:spacing w:before="100" w:beforeAutospacing="1" w:after="100" w:afterAutospacing="1" w:line="240" w:lineRule="auto"/>
         <w:rPr>
           <w:rFonts w:ascii="Times New Roman" w:eastAsia="Times New Roman" w:hAnsi="Times New Roman" w:cs="Times New Roman"/>
-          <w:b/>
-          <w:bCs/>
           <w:sz w:val="24"/>
           <w:szCs w:val="24"/>
         </w:rPr>
@@ -6291,12 +6289,10 @@
       <w:r>
         <w:rPr>
           <w:rFonts w:ascii="Times New Roman" w:eastAsia="Times New Roman" w:hAnsi="Times New Roman" w:cs="Times New Roman"/>
-          <w:b/>
-          <w:bCs/>
           <w:sz w:val="24"/>
           <w:szCs w:val="24"/>
         </w:rPr>
-        <w:t>HTLM Code:</w:t>
+        <w:t>The code is lengthy therefore I uploaded it to the GitHub repository</w:t>
       </w:r>
     </w:p>
     <w:p>
@@ -6304,22 +6300,21 @@
         <w:spacing w:before="100" w:beforeAutospacing="1" w:after="100" w:afterAutospacing="1" w:line="240" w:lineRule="auto"/>
         <w:rPr>
           <w:rFonts w:ascii="Times New Roman" w:eastAsia="Times New Roman" w:hAnsi="Times New Roman" w:cs="Times New Roman"/>
-          <w:b/>
-          <w:bCs/>
           <w:sz w:val="24"/>
           <w:szCs w:val="24"/>
         </w:rPr>
       </w:pPr>
-      <w:r>
-        <w:rPr>
-          <w:rFonts w:ascii="Times New Roman" w:eastAsia="Times New Roman" w:hAnsi="Times New Roman" w:cs="Times New Roman"/>
-          <w:b/>
-          <w:bCs/>
-          <w:sz w:val="24"/>
-          <w:szCs w:val="24"/>
-        </w:rPr>
-        <w:t>CSS Code:</w:t>
-      </w:r>
+      <w:hyperlink r:id="rId14" w:history="1">
+        <w:r>
+          <w:rPr>
+            <w:rStyle w:val="Hyperlink"/>
+            <w:rFonts w:ascii="Times New Roman" w:eastAsia="Times New Roman" w:hAnsi="Times New Roman" w:cs="Times New Roman"/>
+            <w:sz w:val="24"/>
+            <w:szCs w:val="24"/>
+          </w:rPr>
+          <w:t>Please Click to View Source code for the UI Mockup</w:t>
+        </w:r>
+      </w:hyperlink>
     </w:p>
     <w:p>
       <w:pPr>
@@ -6332,7 +6327,10 @@
           <w:szCs w:val="28"/>
         </w:rPr>
       </w:pPr>
-      <w:r>
+    </w:p>
+    <w:p>
+      <w:pPr>
+        <w:spacing w:before="100" w:beforeAutospacing="1" w:after="100" w:afterAutospacing="1" w:line="240" w:lineRule="auto"/>
         <w:rPr>
           <w:rFonts w:ascii="Times New Roman" w:eastAsia="Times New Roman" w:hAnsi="Times New Roman" w:cs="Times New Roman"/>
           <w:b/>
@@ -6340,8 +6338,7 @@
           <w:sz w:val="28"/>
           <w:szCs w:val="28"/>
         </w:rPr>
-        <w:t>Task#5:</w:t>
-      </w:r>
+      </w:pPr>
     </w:p>
     <w:p>
       <w:pPr>
@@ -6362,6 +6359,29 @@
           <w:sz w:val="28"/>
           <w:szCs w:val="28"/>
         </w:rPr>
+        <w:lastRenderedPageBreak/>
+        <w:t>Task#5:</w:t>
+      </w:r>
+    </w:p>
+    <w:p>
+      <w:pPr>
+        <w:spacing w:before="100" w:beforeAutospacing="1" w:after="100" w:afterAutospacing="1" w:line="240" w:lineRule="auto"/>
+        <w:rPr>
+          <w:rFonts w:ascii="Times New Roman" w:eastAsia="Times New Roman" w:hAnsi="Times New Roman" w:cs="Times New Roman"/>
+          <w:b/>
+          <w:bCs/>
+          <w:sz w:val="28"/>
+          <w:szCs w:val="28"/>
+        </w:rPr>
+      </w:pPr>
+      <w:r>
+        <w:rPr>
+          <w:rFonts w:ascii="Times New Roman" w:eastAsia="Times New Roman" w:hAnsi="Times New Roman" w:cs="Times New Roman"/>
+          <w:b/>
+          <w:bCs/>
+          <w:sz w:val="28"/>
+          <w:szCs w:val="28"/>
+        </w:rPr>
         <w:t>Solution:</w:t>
       </w:r>
     </w:p>
@@ -6380,9 +6400,29 @@
           <w:sz w:val="24"/>
           <w:szCs w:val="24"/>
         </w:rPr>
-        <w:lastRenderedPageBreak/>
         <w:t>Successfully Uploaded to GitHub repository</w:t>
       </w:r>
+    </w:p>
+    <w:p>
+      <w:pPr>
+        <w:spacing w:before="100" w:beforeAutospacing="1" w:after="100" w:afterAutospacing="1" w:line="240" w:lineRule="auto"/>
+        <w:rPr>
+          <w:rFonts w:ascii="Times New Roman" w:eastAsia="Times New Roman" w:hAnsi="Times New Roman" w:cs="Times New Roman"/>
+          <w:sz w:val="24"/>
+          <w:szCs w:val="24"/>
+        </w:rPr>
+      </w:pPr>
+      <w:hyperlink r:id="rId15" w:history="1">
+        <w:r>
+          <w:rPr>
+            <w:rStyle w:val="Hyperlink"/>
+            <w:rFonts w:ascii="Times New Roman" w:eastAsia="Times New Roman" w:hAnsi="Times New Roman" w:cs="Times New Roman"/>
+            <w:sz w:val="24"/>
+            <w:szCs w:val="24"/>
+          </w:rPr>
+          <w:t>Please Click to Visit GitHub Repo</w:t>
+        </w:r>
+      </w:hyperlink>
     </w:p>
     <w:p>
       <w:pPr>
@@ -10373,4 +10413,16 @@
     </a:ext>
   </a:extLst>
 </a:theme>
+</file>
+
+<file path=customXml/item1.xml><?xml version="1.0" encoding="utf-8"?>
+<b:Sources xmlns:b="http://schemas.openxmlformats.org/officeDocument/2006/bibliography" xmlns="http://schemas.openxmlformats.org/officeDocument/2006/bibliography" SelectedStyle="\APASixthEditionOfficeOnline.xsl" StyleName="APA" Version="6"/>
+</file>
+
+<file path=customXml/itemProps1.xml><?xml version="1.0" encoding="utf-8"?>
+<ds:datastoreItem xmlns:ds="http://schemas.openxmlformats.org/officeDocument/2006/customXml" ds:itemID="{3DC63012-C76C-4237-A27B-14BA0C86874D}">
+  <ds:schemaRefs>
+    <ds:schemaRef ds:uri="http://schemas.openxmlformats.org/officeDocument/2006/bibliography"/>
+  </ds:schemaRefs>
+</ds:datastoreItem>
 </file>
</xml_diff>